<commit_message>
docs(nsfc-demo): 为 ev-machine-perfusion transplant IRI 综述插入 4 张决策表与 3 张图片
- 新增表 1-4：EV 三种角色、灌注模式递送窗口、最小证据包、标志物三层决策框架
- 使用 booktabs+tabularx 排版，PDF 表题前缀本地化为表
- 通过 auto-draw-plot (gpt-image-2) 生成机制与未来方向示意图
- 同步导出 TeX/PDF/Word，更新验证报告、Prompts 日志、.gitignore 和 BAC 账本
</commit_message>
<xml_diff>
--- a/nsfc-demo/reviews/ev-machine-perfusion-transplant-iri/ev-machine-perfusion-transplant-iri_review.docx
+++ b/nsfc-demo/reviews/ev-machine-perfusion-transplant-iri/ev-machine-perfusion-transplant-iri_review.docx
@@ -676,6 +676,424 @@
         <w:t xml:space="preserve">在这一场景中至少有三种角色：第一，作为供体器官损伤和免疫原性的输出信号；第二，作为灌注期修复药物或递送载体；第三，作为评价机器灌注是否真正改变器官状态的伴随诊断工具。这三种角色相互重叠，也正是后续转化研究最容易混淆的地方。</w:t>
       </w:r>
     </w:p>
+    <w:p>
+      <w:pPr>
+        <w:pStyle w:val="BodyText"/>
+      </w:pPr>
+      <w:r>
+        <w:rPr>
+          <w:rFonts w:hint="eastAsia"/>
+          <w:b/>
+          <w:bCs/>
+        </w:rPr>
+        <w:t xml:space="preserve">表</w:t>
+      </w:r>
+      <w:r>
+        <w:rPr>
+          <w:b/>
+          <w:bCs/>
+        </w:rPr>
+        <w:t xml:space="preserve"> 1. </w:t>
+      </w:r>
+      <w:r>
+        <w:rPr>
+          <w:rFonts w:hint="eastAsia"/>
+          <w:b/>
+          <w:bCs/>
+        </w:rPr>
+        <w:t xml:space="preserve">机器灌注语境下</w:t>
+      </w:r>
+      <w:r>
+        <w:rPr>
+          <w:b/>
+          <w:bCs/>
+        </w:rPr>
+        <w:t xml:space="preserve"> EV </w:t>
+      </w:r>
+      <w:r>
+        <w:rPr>
+          <w:rFonts w:hint="eastAsia"/>
+          <w:b/>
+          <w:bCs/>
+        </w:rPr>
+        <w:t xml:space="preserve">研究的三种角色。</w:t>
+      </w:r>
+    </w:p>
+    <w:tbl>
+      <w:tblPr>
+        <w:tblStyle w:val="Table"/>
+        <w:tblW w:type="pct" w:w="5000"/>
+        <w:tblLayout w:type="fixed"/>
+        <w:tblLook w:firstRow="1" w:lastRow="0" w:firstColumn="0" w:lastColumn="0" w:noHBand="0" w:noVBand="0" w:val="0020"/>
+      </w:tblPr>
+      <w:tblGrid>
+        <w:gridCol w:w="1980"/>
+        <w:gridCol w:w="1980"/>
+        <w:gridCol w:w="1980"/>
+        <w:gridCol w:w="1980"/>
+      </w:tblGrid>
+      <w:tr>
+        <w:trPr>
+          <w:tblHeader w:val="on"/>
+        </w:trPr>
+        <w:tc>
+          <w:tcPr/>
+          <w:p>
+            <w:pPr>
+              <w:pStyle w:val="Compact"/>
+            </w:pPr>
+            <w:r>
+              <w:rPr>
+                <w:rFonts w:hint="eastAsia"/>
+              </w:rPr>
+              <w:t xml:space="preserve">角色</w:t>
+            </w:r>
+          </w:p>
+        </w:tc>
+        <w:tc>
+          <w:tcPr/>
+          <w:p>
+            <w:pPr>
+              <w:pStyle w:val="Compact"/>
+            </w:pPr>
+            <w:r>
+              <w:rPr>
+                <w:rFonts w:hint="eastAsia"/>
+              </w:rPr>
+              <w:t xml:space="preserve">灌注期看到的信号</w:t>
+            </w:r>
+          </w:p>
+        </w:tc>
+        <w:tc>
+          <w:tcPr/>
+          <w:p>
+            <w:pPr>
+              <w:pStyle w:val="Compact"/>
+            </w:pPr>
+            <w:r>
+              <w:rPr>
+                <w:rFonts w:hint="eastAsia"/>
+              </w:rPr>
+              <w:t xml:space="preserve">最该联动的读数</w:t>
+            </w:r>
+          </w:p>
+        </w:tc>
+        <w:tc>
+          <w:tcPr/>
+          <w:p>
+            <w:pPr>
+              <w:pStyle w:val="Compact"/>
+            </w:pPr>
+            <w:r>
+              <w:rPr>
+                <w:rFonts w:hint="eastAsia"/>
+              </w:rPr>
+              <w:t xml:space="preserve">容易发生的误读</w:t>
+            </w:r>
+          </w:p>
+        </w:tc>
+      </w:tr>
+      <w:tr>
+        <w:tc>
+          <w:tcPr/>
+          <w:p>
+            <w:pPr>
+              <w:pStyle w:val="Compact"/>
+            </w:pPr>
+            <w:r>
+              <w:rPr>
+                <w:rFonts w:hint="eastAsia"/>
+              </w:rPr>
+              <w:t xml:space="preserve">损伤扩音器</w:t>
+            </w:r>
+          </w:p>
+        </w:tc>
+        <w:tc>
+          <w:tcPr/>
+          <w:p>
+            <w:pPr>
+              <w:pStyle w:val="Compact"/>
+            </w:pPr>
+            <w:r>
+              <w:rPr>
+                <w:rFonts w:hint="eastAsia"/>
+              </w:rPr>
+              <w:t xml:space="preserve">内皮、肾小管、胆管、心肌或免疫细胞释放的</w:t>
+            </w:r>
+            <w:r>
+              <w:t xml:space="preserve"> EV </w:t>
+            </w:r>
+            <w:r>
+              <w:rPr>
+                <w:rFonts w:hint="eastAsia"/>
+              </w:rPr>
+              <w:t xml:space="preserve">增多，cargo</w:t>
+            </w:r>
+            <w:r>
+              <w:t xml:space="preserve"> </w:t>
+            </w:r>
+            <w:r>
+              <w:rPr>
+                <w:rFonts w:hint="eastAsia"/>
+              </w:rPr>
+              <w:t xml:space="preserve">中出现氧化脂质、mtDNA、补体/凝血相关蛋白或促炎</w:t>
+            </w:r>
+            <w:r>
+              <w:t xml:space="preserve"> miRNA</w:t>
+            </w:r>
+          </w:p>
+        </w:tc>
+        <w:tc>
+          <w:tcPr/>
+          <w:p>
+            <w:pPr>
+              <w:pStyle w:val="Compact"/>
+            </w:pPr>
+            <w:r>
+              <w:rPr>
+                <w:rFonts w:hint="eastAsia"/>
+              </w:rPr>
+              <w:t xml:space="preserve">灌注阻力、酶学释放、糖萼脱落、组织病理、术后</w:t>
+            </w:r>
+            <w:r>
+              <w:t xml:space="preserve"> DGF/PGD </w:t>
+            </w:r>
+            <w:r>
+              <w:rPr>
+                <w:rFonts w:hint="eastAsia"/>
+              </w:rPr>
+              <w:t xml:space="preserve">或</w:t>
+            </w:r>
+            <w:r>
+              <w:t xml:space="preserve"> dd-cfDNA</w:t>
+            </w:r>
+          </w:p>
+        </w:tc>
+        <w:tc>
+          <w:tcPr/>
+          <w:p>
+            <w:pPr>
+              <w:pStyle w:val="Compact"/>
+            </w:pPr>
+            <w:r>
+              <w:rPr>
+                <w:rFonts w:hint="eastAsia"/>
+              </w:rPr>
+              <w:t xml:space="preserve">把</w:t>
+            </w:r>
+            <w:r>
+              <w:t xml:space="preserve"> EV </w:t>
+            </w:r>
+            <w:r>
+              <w:rPr>
+                <w:rFonts w:hint="eastAsia"/>
+              </w:rPr>
+              <w:t xml:space="preserve">浓度升高直接等同于</w:t>
+            </w:r>
+            <w:r>
+              <w:t xml:space="preserve"> EV </w:t>
+            </w:r>
+            <w:r>
+              <w:rPr>
+                <w:rFonts w:hint="eastAsia"/>
+              </w:rPr>
+              <w:t xml:space="preserve">驱动病理，忽视细胞破裂、灌注液浓缩和吸附柱影响</w:t>
+            </w:r>
+          </w:p>
+        </w:tc>
+      </w:tr>
+      <w:tr>
+        <w:tc>
+          <w:tcPr/>
+          <w:p>
+            <w:pPr>
+              <w:pStyle w:val="Compact"/>
+            </w:pPr>
+            <w:r>
+              <w:rPr>
+                <w:rFonts w:hint="eastAsia"/>
+              </w:rPr>
+              <w:t xml:space="preserve">修复载体</w:t>
+            </w:r>
+          </w:p>
+        </w:tc>
+        <w:tc>
+          <w:tcPr/>
+          <w:p>
+            <w:pPr>
+              <w:pStyle w:val="Compact"/>
+            </w:pPr>
+            <w:r>
+              <w:rPr>
+                <w:rFonts w:hint="eastAsia"/>
+              </w:rPr>
+              <w:t xml:space="preserve">外源</w:t>
+            </w:r>
+            <w:r>
+              <w:t xml:space="preserve"> </w:t>
+            </w:r>
+            <w:r>
+              <w:rPr>
+                <w:rFonts w:hint="eastAsia"/>
+              </w:rPr>
+              <w:t xml:space="preserve">MSC-EV、尿液祖细胞</w:t>
+            </w:r>
+            <w:r>
+              <w:t xml:space="preserve"> EV </w:t>
+            </w:r>
+            <w:r>
+              <w:rPr>
+                <w:rFonts w:hint="eastAsia"/>
+              </w:rPr>
+              <w:t xml:space="preserve">或工程化</w:t>
+            </w:r>
+            <w:r>
+              <w:t xml:space="preserve"> EV </w:t>
+            </w:r>
+            <w:r>
+              <w:rPr>
+                <w:rFonts w:hint="eastAsia"/>
+              </w:rPr>
+              <w:t xml:space="preserve">在血管腔、内皮和实质细胞间分布，并改变炎症/细胞死亡读数</w:t>
+            </w:r>
+          </w:p>
+        </w:tc>
+        <w:tc>
+          <w:tcPr/>
+          <w:p>
+            <w:pPr>
+              <w:pStyle w:val="Compact"/>
+            </w:pPr>
+            <w:r>
+              <w:t xml:space="preserve">EV </w:t>
+            </w:r>
+            <w:r>
+              <w:rPr>
+                <w:rFonts w:hint="eastAsia"/>
+              </w:rPr>
+              <w:t xml:space="preserve">暴露量、洗脱效率、组织摄取、补体沉积、线粒体膜电位、胆汁/尿液质量</w:t>
+            </w:r>
+          </w:p>
+        </w:tc>
+        <w:tc>
+          <w:tcPr/>
+          <w:p>
+            <w:pPr>
+              <w:pStyle w:val="Compact"/>
+            </w:pPr>
+            <w:r>
+              <w:rPr>
+                <w:rFonts w:hint="eastAsia"/>
+              </w:rPr>
+              <w:t xml:space="preserve">只报告“抗炎下降”，没有证明</w:t>
+            </w:r>
+            <w:r>
+              <w:t xml:space="preserve"> EV </w:t>
+            </w:r>
+            <w:r>
+              <w:rPr>
+                <w:rFonts w:hint="eastAsia"/>
+              </w:rPr>
+              <w:t xml:space="preserve">到达靶细胞、cargo</w:t>
+            </w:r>
+            <w:r>
+              <w:t xml:space="preserve"> </w:t>
+            </w:r>
+            <w:r>
+              <w:rPr>
+                <w:rFonts w:hint="eastAsia"/>
+              </w:rPr>
+              <w:t xml:space="preserve">保留和剂量-效应关系</w:t>
+            </w:r>
+          </w:p>
+        </w:tc>
+      </w:tr>
+      <w:tr>
+        <w:tc>
+          <w:tcPr/>
+          <w:p>
+            <w:pPr>
+              <w:pStyle w:val="Compact"/>
+            </w:pPr>
+            <w:r>
+              <w:rPr>
+                <w:rFonts w:hint="eastAsia"/>
+              </w:rPr>
+              <w:t xml:space="preserve">伴随诊断</w:t>
+            </w:r>
+          </w:p>
+        </w:tc>
+        <w:tc>
+          <w:tcPr/>
+          <w:p>
+            <w:pPr>
+              <w:pStyle w:val="Compact"/>
+            </w:pPr>
+            <w:r>
+              <w:rPr>
+                <w:rFonts w:hint="eastAsia"/>
+              </w:rPr>
+              <w:t xml:space="preserve">灌注液</w:t>
+            </w:r>
+            <w:r>
+              <w:t xml:space="preserve"> </w:t>
+            </w:r>
+            <w:r>
+              <w:rPr>
+                <w:rFonts w:hint="eastAsia"/>
+              </w:rPr>
+              <w:t xml:space="preserve">EV/miRNA、蛋白组、代谢物与器官功能读数在同一时间轴变化</w:t>
+            </w:r>
+          </w:p>
+        </w:tc>
+        <w:tc>
+          <w:tcPr/>
+          <w:p>
+            <w:pPr>
+              <w:pStyle w:val="Compact"/>
+            </w:pPr>
+            <w:r>
+              <w:rPr>
+                <w:rFonts w:hint="eastAsia"/>
+              </w:rPr>
+              <w:t xml:space="preserve">器官取舍阈值、是否需要追加干预、植入后监测强度、排斥风险模型</w:t>
+            </w:r>
+          </w:p>
+        </w:tc>
+        <w:tc>
+          <w:tcPr/>
+          <w:p>
+            <w:pPr>
+              <w:pStyle w:val="Compact"/>
+            </w:pPr>
+            <w:r>
+              <w:rPr>
+                <w:rFonts w:hint="eastAsia"/>
+              </w:rPr>
+              <w:t xml:space="preserve">用单个</w:t>
+            </w:r>
+            <w:r>
+              <w:t xml:space="preserve"> miRNA </w:t>
+            </w:r>
+            <w:r>
+              <w:rPr>
+                <w:rFonts w:hint="eastAsia"/>
+              </w:rPr>
+              <w:t xml:space="preserve">代替多层风险判断，或把治疗性</w:t>
+            </w:r>
+            <w:r>
+              <w:t xml:space="preserve"> EV </w:t>
+            </w:r>
+            <w:r>
+              <w:rPr>
+                <w:rFonts w:hint="eastAsia"/>
+              </w:rPr>
+              <w:t xml:space="preserve">残留当成内源性损伤信号</w:t>
+            </w:r>
+          </w:p>
+        </w:tc>
+      </w:tr>
+    </w:tbl>
     <w:bookmarkEnd w:id="10"/>
     <w:bookmarkStart w:id="11" w:name="iri-的免疫机制从线粒体失衡到排斥风险"/>
     <w:p>
@@ -1627,6 +2045,532 @@
       <w:r>
         <w:rPr>
           <w:rFonts w:hint="eastAsia"/>
+          <w:b/>
+          <w:bCs/>
+        </w:rPr>
+        <w:t xml:space="preserve">表</w:t>
+      </w:r>
+      <w:r>
+        <w:rPr>
+          <w:b/>
+          <w:bCs/>
+        </w:rPr>
+        <w:t xml:space="preserve"> 2. </w:t>
+      </w:r>
+      <w:r>
+        <w:rPr>
+          <w:rFonts w:hint="eastAsia"/>
+          <w:b/>
+          <w:bCs/>
+        </w:rPr>
+        <w:t xml:space="preserve">不同机器灌注模式中的</w:t>
+      </w:r>
+      <w:r>
+        <w:rPr>
+          <w:b/>
+          <w:bCs/>
+        </w:rPr>
+        <w:t xml:space="preserve"> EV </w:t>
+      </w:r>
+      <w:r>
+        <w:rPr>
+          <w:rFonts w:hint="eastAsia"/>
+          <w:b/>
+          <w:bCs/>
+        </w:rPr>
+        <w:t xml:space="preserve">递送窗口。</w:t>
+      </w:r>
+    </w:p>
+    <w:tbl>
+      <w:tblPr>
+        <w:tblStyle w:val="Table"/>
+        <w:tblW w:type="pct" w:w="5000"/>
+        <w:tblLayout w:type="fixed"/>
+        <w:tblLook w:firstRow="1" w:lastRow="0" w:firstColumn="0" w:lastColumn="0" w:noHBand="0" w:noVBand="0" w:val="0020"/>
+      </w:tblPr>
+      <w:tblGrid>
+        <w:gridCol w:w="1584"/>
+        <w:gridCol w:w="1584"/>
+        <w:gridCol w:w="1584"/>
+        <w:gridCol w:w="1584"/>
+        <w:gridCol w:w="1584"/>
+      </w:tblGrid>
+      <w:tr>
+        <w:trPr>
+          <w:tblHeader w:val="on"/>
+        </w:trPr>
+        <w:tc>
+          <w:tcPr/>
+          <w:p>
+            <w:pPr>
+              <w:pStyle w:val="Compact"/>
+            </w:pPr>
+            <w:r>
+              <w:rPr>
+                <w:rFonts w:hint="eastAsia"/>
+              </w:rPr>
+              <w:t xml:space="preserve">灌注模式</w:t>
+            </w:r>
+          </w:p>
+        </w:tc>
+        <w:tc>
+          <w:tcPr/>
+          <w:p>
+            <w:pPr>
+              <w:pStyle w:val="Compact"/>
+            </w:pPr>
+            <w:r>
+              <w:t xml:space="preserve">EV </w:t>
+            </w:r>
+            <w:r>
+              <w:rPr>
+                <w:rFonts w:hint="eastAsia"/>
+              </w:rPr>
+              <w:t xml:space="preserve">在该窗口中的主要任务</w:t>
+            </w:r>
+          </w:p>
+        </w:tc>
+        <w:tc>
+          <w:tcPr/>
+          <w:p>
+            <w:pPr>
+              <w:pStyle w:val="Compact"/>
+            </w:pPr>
+            <w:r>
+              <w:rPr>
+                <w:rFonts w:hint="eastAsia"/>
+              </w:rPr>
+              <w:t xml:space="preserve">优势</w:t>
+            </w:r>
+          </w:p>
+        </w:tc>
+        <w:tc>
+          <w:tcPr/>
+          <w:p>
+            <w:pPr>
+              <w:pStyle w:val="Compact"/>
+            </w:pPr>
+            <w:r>
+              <w:rPr>
+                <w:rFonts w:hint="eastAsia"/>
+              </w:rPr>
+              <w:t xml:space="preserve">风险或盲区</w:t>
+            </w:r>
+          </w:p>
+        </w:tc>
+        <w:tc>
+          <w:tcPr/>
+          <w:p>
+            <w:pPr>
+              <w:pStyle w:val="Compact"/>
+            </w:pPr>
+            <w:r>
+              <w:rPr>
+                <w:rFonts w:hint="eastAsia"/>
+              </w:rPr>
+              <w:t xml:space="preserve">更合适的验证终点</w:t>
+            </w:r>
+          </w:p>
+        </w:tc>
+      </w:tr>
+      <w:tr>
+        <w:tc>
+          <w:tcPr/>
+          <w:p>
+            <w:pPr>
+              <w:pStyle w:val="Compact"/>
+            </w:pPr>
+            <w:r>
+              <w:t xml:space="preserve">HOPE/HMP</w:t>
+            </w:r>
+          </w:p>
+        </w:tc>
+        <w:tc>
+          <w:tcPr/>
+          <w:p>
+            <w:pPr>
+              <w:pStyle w:val="Compact"/>
+            </w:pPr>
+            <w:r>
+              <w:rPr>
+                <w:rFonts w:hint="eastAsia"/>
+              </w:rPr>
+              <w:t xml:space="preserve">内皮保护、补体/线粒体预处理、降低再氧合初始冲击</w:t>
+            </w:r>
+          </w:p>
+        </w:tc>
+        <w:tc>
+          <w:tcPr/>
+          <w:p>
+            <w:pPr>
+              <w:pStyle w:val="Compact"/>
+            </w:pPr>
+            <w:r>
+              <w:rPr>
+                <w:rFonts w:hint="eastAsia"/>
+              </w:rPr>
+              <w:t xml:space="preserve">低温降低代谢负荷，未结合</w:t>
+            </w:r>
+            <w:r>
+              <w:t xml:space="preserve"> EV </w:t>
+            </w:r>
+            <w:r>
+              <w:rPr>
+                <w:rFonts w:hint="eastAsia"/>
+              </w:rPr>
+              <w:t xml:space="preserve">可在植入前洗脱，适合高风险</w:t>
+            </w:r>
+            <w:r>
+              <w:t xml:space="preserve"> DCD </w:t>
+            </w:r>
+            <w:r>
+              <w:rPr>
+                <w:rFonts w:hint="eastAsia"/>
+              </w:rPr>
+              <w:t xml:space="preserve">或长冷缺血器官</w:t>
+            </w:r>
+          </w:p>
+        </w:tc>
+        <w:tc>
+          <w:tcPr/>
+          <w:p>
+            <w:pPr>
+              <w:pStyle w:val="Compact"/>
+            </w:pPr>
+            <w:r>
+              <w:rPr>
+                <w:rFonts w:hint="eastAsia"/>
+              </w:rPr>
+              <w:t xml:space="preserve">主动内吞较弱，药效可能停留在血管腔或内皮表面；低温下</w:t>
+            </w:r>
+            <w:r>
+              <w:t xml:space="preserve"> cargo </w:t>
+            </w:r>
+            <w:r>
+              <w:rPr>
+                <w:rFonts w:hint="eastAsia"/>
+              </w:rPr>
+              <w:t xml:space="preserve">释放难解释</w:t>
+            </w:r>
+          </w:p>
+        </w:tc>
+        <w:tc>
+          <w:tcPr/>
+          <w:p>
+            <w:pPr>
+              <w:pStyle w:val="Compact"/>
+            </w:pPr>
+            <w:r>
+              <w:rPr>
+                <w:rFonts w:hint="eastAsia"/>
+              </w:rPr>
+              <w:t xml:space="preserve">血管阻力、ATP/succinate、补体沉积、糖萼脱落、洗脱后残留</w:t>
+            </w:r>
+            <w:r>
+              <w:t xml:space="preserve"> EV</w:t>
+            </w:r>
+          </w:p>
+        </w:tc>
+      </w:tr>
+      <w:tr>
+        <w:tc>
+          <w:tcPr/>
+          <w:p>
+            <w:pPr>
+              <w:pStyle w:val="Compact"/>
+            </w:pPr>
+            <w:r>
+              <w:rPr>
+                <w:rFonts w:hint="eastAsia"/>
+              </w:rPr>
+              <w:t xml:space="preserve">控制性复温</w:t>
+            </w:r>
+          </w:p>
+        </w:tc>
+        <w:tc>
+          <w:tcPr/>
+          <w:p>
+            <w:pPr>
+              <w:pStyle w:val="Compact"/>
+            </w:pPr>
+            <w:r>
+              <w:rPr>
+                <w:rFonts w:hint="eastAsia"/>
+              </w:rPr>
+              <w:t xml:space="preserve">区分低温保护、复温损伤与常温修复，并为分阶段给药留出时间</w:t>
+            </w:r>
+          </w:p>
+        </w:tc>
+        <w:tc>
+          <w:tcPr/>
+          <w:p>
+            <w:pPr>
+              <w:pStyle w:val="Compact"/>
+            </w:pPr>
+            <w:r>
+              <w:rPr>
+                <w:rFonts w:hint="eastAsia"/>
+              </w:rPr>
+              <w:t xml:space="preserve">可先移除有害</w:t>
+            </w:r>
+            <w:r>
+              <w:t xml:space="preserve"> </w:t>
+            </w:r>
+            <w:r>
+              <w:rPr>
+                <w:rFonts w:hint="eastAsia"/>
+              </w:rPr>
+              <w:t xml:space="preserve">EV/miRNA，再递送修复性</w:t>
+            </w:r>
+            <w:r>
+              <w:t xml:space="preserve"> </w:t>
+            </w:r>
+            <w:r>
+              <w:rPr>
+                <w:rFonts w:hint="eastAsia"/>
+              </w:rPr>
+              <w:t xml:space="preserve">EV；温度爬升有助于观察阶段性药效</w:t>
+            </w:r>
+          </w:p>
+        </w:tc>
+        <w:tc>
+          <w:tcPr/>
+          <w:p>
+            <w:pPr>
+              <w:pStyle w:val="Compact"/>
+            </w:pPr>
+            <w:r>
+              <w:rPr>
+                <w:rFonts w:hint="eastAsia"/>
+              </w:rPr>
+              <w:t xml:space="preserve">工程变量多，温度、氧合、吸附和换液都会改变</w:t>
+            </w:r>
+            <w:r>
+              <w:t xml:space="preserve"> EV </w:t>
+            </w:r>
+            <w:r>
+              <w:rPr>
+                <w:rFonts w:hint="eastAsia"/>
+              </w:rPr>
+              <w:t xml:space="preserve">谱</w:t>
+            </w:r>
+          </w:p>
+        </w:tc>
+        <w:tc>
+          <w:tcPr/>
+          <w:p>
+            <w:pPr>
+              <w:pStyle w:val="Compact"/>
+            </w:pPr>
+            <w:r>
+              <w:rPr>
+                <w:rFonts w:hint="eastAsia"/>
+              </w:rPr>
+              <w:t xml:space="preserve">复温斜率、ROS/炎症小体、灌注液</w:t>
+            </w:r>
+            <w:r>
+              <w:t xml:space="preserve"> EV </w:t>
+            </w:r>
+            <w:r>
+              <w:rPr>
+                <w:rFonts w:hint="eastAsia"/>
+              </w:rPr>
+              <w:t xml:space="preserve">时间序列、组织摄取定位</w:t>
+            </w:r>
+          </w:p>
+        </w:tc>
+      </w:tr>
+      <w:tr>
+        <w:tc>
+          <w:tcPr/>
+          <w:p>
+            <w:pPr>
+              <w:pStyle w:val="Compact"/>
+            </w:pPr>
+            <w:r>
+              <w:t xml:space="preserve">NMP</w:t>
+            </w:r>
+          </w:p>
+        </w:tc>
+        <w:tc>
+          <w:tcPr/>
+          <w:p>
+            <w:pPr>
+              <w:pStyle w:val="Compact"/>
+            </w:pPr>
+            <w:r>
+              <w:rPr>
+                <w:rFonts w:hint="eastAsia"/>
+              </w:rPr>
+              <w:t xml:space="preserve">功能评估、代谢恢复、细胞摄取和短时药效观察</w:t>
+            </w:r>
+          </w:p>
+        </w:tc>
+        <w:tc>
+          <w:tcPr/>
+          <w:p>
+            <w:pPr>
+              <w:pStyle w:val="Compact"/>
+            </w:pPr>
+            <w:r>
+              <w:rPr>
+                <w:rFonts w:hint="eastAsia"/>
+              </w:rPr>
+              <w:t xml:space="preserve">接近生理代谢，可同时观察乳酸清除、胆汁/尿液、心肌酶和肺顺应性</w:t>
+            </w:r>
+          </w:p>
+        </w:tc>
+        <w:tc>
+          <w:tcPr/>
+          <w:p>
+            <w:pPr>
+              <w:pStyle w:val="Compact"/>
+            </w:pPr>
+            <w:r>
+              <w:rPr>
+                <w:rFonts w:hint="eastAsia"/>
+              </w:rPr>
+              <w:t xml:space="preserve">含血灌注液带来蛋白冠、吞噬清除、促凝和外源颗粒背景</w:t>
+            </w:r>
+          </w:p>
+        </w:tc>
+        <w:tc>
+          <w:tcPr/>
+          <w:p>
+            <w:pPr>
+              <w:pStyle w:val="Compact"/>
+            </w:pPr>
+            <w:r>
+              <w:rPr>
+                <w:rFonts w:hint="eastAsia"/>
+              </w:rPr>
+              <w:t xml:space="preserve">乳酸清除、胆汁质量、尿液生成、心肌酶释放、EV</w:t>
+            </w:r>
+            <w:r>
+              <w:t xml:space="preserve"> </w:t>
+            </w:r>
+            <w:r>
+              <w:rPr>
+                <w:rFonts w:hint="eastAsia"/>
+              </w:rPr>
+              <w:t xml:space="preserve">药代和促凝安全性</w:t>
+            </w:r>
+          </w:p>
+        </w:tc>
+      </w:tr>
+      <w:tr>
+        <w:tc>
+          <w:tcPr/>
+          <w:p>
+            <w:pPr>
+              <w:pStyle w:val="Compact"/>
+            </w:pPr>
+            <w:r>
+              <w:t xml:space="preserve">HMP+NMP</w:t>
+            </w:r>
+          </w:p>
+        </w:tc>
+        <w:tc>
+          <w:tcPr/>
+          <w:p>
+            <w:pPr>
+              <w:pStyle w:val="Compact"/>
+            </w:pPr>
+            <w:r>
+              <w:rPr>
+                <w:rFonts w:hint="eastAsia"/>
+              </w:rPr>
+              <w:t xml:space="preserve">先保护和稳定器官，再在常温阶段评价</w:t>
+            </w:r>
+            <w:r>
+              <w:t xml:space="preserve"> EV </w:t>
+            </w:r>
+            <w:r>
+              <w:rPr>
+                <w:rFonts w:hint="eastAsia"/>
+              </w:rPr>
+              <w:t xml:space="preserve">药效</w:t>
+            </w:r>
+          </w:p>
+        </w:tc>
+        <w:tc>
+          <w:tcPr/>
+          <w:p>
+            <w:pPr>
+              <w:pStyle w:val="Compact"/>
+            </w:pPr>
+            <w:r>
+              <w:rPr>
+                <w:rFonts w:hint="eastAsia"/>
+              </w:rPr>
+              <w:t xml:space="preserve">兼顾物流稳定性与功能读数，适合临床前桥接</w:t>
+            </w:r>
+          </w:p>
+        </w:tc>
+        <w:tc>
+          <w:tcPr/>
+          <w:p>
+            <w:pPr>
+              <w:pStyle w:val="Compact"/>
+            </w:pPr>
+            <w:r>
+              <w:rPr>
+                <w:rFonts w:hint="eastAsia"/>
+              </w:rPr>
+              <w:t xml:space="preserve">难以判定获益来自</w:t>
+            </w:r>
+            <w:r>
+              <w:t xml:space="preserve"> HMP、NMP </w:t>
+            </w:r>
+            <w:r>
+              <w:rPr>
+                <w:rFonts w:hint="eastAsia"/>
+              </w:rPr>
+              <w:t xml:space="preserve">还是</w:t>
+            </w:r>
+            <w:r>
+              <w:t xml:space="preserve"> </w:t>
+            </w:r>
+            <w:r>
+              <w:rPr>
+                <w:rFonts w:hint="eastAsia"/>
+              </w:rPr>
+              <w:t xml:space="preserve">EV；需要严密对照</w:t>
+            </w:r>
+          </w:p>
+        </w:tc>
+        <w:tc>
+          <w:tcPr/>
+          <w:p>
+            <w:pPr>
+              <w:pStyle w:val="Compact"/>
+            </w:pPr>
+            <w:r>
+              <w:rPr>
+                <w:rFonts w:hint="eastAsia"/>
+              </w:rPr>
+              <w:t xml:space="preserve">分阶段采样、器官功能恢复、细胞因子谱、组织损伤和</w:t>
+            </w:r>
+            <w:r>
+              <w:t xml:space="preserve"> EV </w:t>
+            </w:r>
+            <w:r>
+              <w:rPr>
+                <w:rFonts w:hint="eastAsia"/>
+              </w:rPr>
+              <w:t xml:space="preserve">残留</w:t>
+            </w:r>
+          </w:p>
+        </w:tc>
+      </w:tr>
+    </w:tbl>
+    <w:p>
+      <w:pPr>
+        <w:pStyle w:val="BodyText"/>
+      </w:pPr>
+      <w:r>
+        <w:rPr>
+          <w:rFonts w:hint="eastAsia"/>
         </w:rPr>
         <w:t xml:space="preserve">机器灌注的最大优势是把治疗递送限制在器官层面。对于</w:t>
       </w:r>
@@ -2576,6 +3520,486 @@
         <w:t xml:space="preserve">下降作为主要效应。</w:t>
       </w:r>
     </w:p>
+    <w:p>
+      <w:pPr>
+        <w:pStyle w:val="BodyText"/>
+      </w:pPr>
+      <w:r>
+        <w:rPr>
+          <w:rFonts w:hint="eastAsia"/>
+          <w:b/>
+          <w:bCs/>
+        </w:rPr>
+        <w:t xml:space="preserve">表</w:t>
+      </w:r>
+      <w:r>
+        <w:rPr>
+          <w:b/>
+          <w:bCs/>
+        </w:rPr>
+        <w:t xml:space="preserve"> 3. </w:t>
+      </w:r>
+      <w:r>
+        <w:rPr>
+          <w:rFonts w:hint="eastAsia"/>
+          <w:b/>
+          <w:bCs/>
+        </w:rPr>
+        <w:t xml:space="preserve">面向灌注期治疗的</w:t>
+      </w:r>
+      <w:r>
+        <w:rPr>
+          <w:b/>
+          <w:bCs/>
+        </w:rPr>
+        <w:t xml:space="preserve"> EV </w:t>
+      </w:r>
+      <w:r>
+        <w:rPr>
+          <w:rFonts w:hint="eastAsia"/>
+          <w:b/>
+          <w:bCs/>
+        </w:rPr>
+        <w:t xml:space="preserve">最小证据包。</w:t>
+      </w:r>
+    </w:p>
+    <w:tbl>
+      <w:tblPr>
+        <w:tblStyle w:val="Table"/>
+        <w:tblW w:type="pct" w:w="5000"/>
+        <w:tblLayout w:type="fixed"/>
+        <w:tblLook w:firstRow="1" w:lastRow="0" w:firstColumn="0" w:lastColumn="0" w:noHBand="0" w:noVBand="0" w:val="0020"/>
+      </w:tblPr>
+      <w:tblGrid>
+        <w:gridCol w:w="1980"/>
+        <w:gridCol w:w="1980"/>
+        <w:gridCol w:w="1980"/>
+        <w:gridCol w:w="1980"/>
+      </w:tblGrid>
+      <w:tr>
+        <w:trPr>
+          <w:tblHeader w:val="on"/>
+        </w:trPr>
+        <w:tc>
+          <w:tcPr/>
+          <w:p>
+            <w:pPr>
+              <w:pStyle w:val="Compact"/>
+            </w:pPr>
+            <w:r>
+              <w:rPr>
+                <w:rFonts w:hint="eastAsia"/>
+              </w:rPr>
+              <w:t xml:space="preserve">证据层级</w:t>
+            </w:r>
+          </w:p>
+        </w:tc>
+        <w:tc>
+          <w:tcPr/>
+          <w:p>
+            <w:pPr>
+              <w:pStyle w:val="Compact"/>
+            </w:pPr>
+            <w:r>
+              <w:rPr>
+                <w:rFonts w:hint="eastAsia"/>
+              </w:rPr>
+              <w:t xml:space="preserve">必须交代什么</w:t>
+            </w:r>
+          </w:p>
+        </w:tc>
+        <w:tc>
+          <w:tcPr/>
+          <w:p>
+            <w:pPr>
+              <w:pStyle w:val="Compact"/>
+            </w:pPr>
+            <w:r>
+              <w:rPr>
+                <w:rFonts w:hint="eastAsia"/>
+              </w:rPr>
+              <w:t xml:space="preserve">不能只用什么替代</w:t>
+            </w:r>
+          </w:p>
+        </w:tc>
+        <w:tc>
+          <w:tcPr/>
+          <w:p>
+            <w:pPr>
+              <w:pStyle w:val="Compact"/>
+            </w:pPr>
+            <w:r>
+              <w:rPr>
+                <w:rFonts w:hint="eastAsia"/>
+              </w:rPr>
+              <w:t xml:space="preserve">对移植</w:t>
+            </w:r>
+            <w:r>
+              <w:t xml:space="preserve"> IRI </w:t>
+            </w:r>
+            <w:r>
+              <w:rPr>
+                <w:rFonts w:hint="eastAsia"/>
+              </w:rPr>
+              <w:t xml:space="preserve">的意义</w:t>
+            </w:r>
+          </w:p>
+        </w:tc>
+      </w:tr>
+      <w:tr>
+        <w:tc>
+          <w:tcPr/>
+          <w:p>
+            <w:pPr>
+              <w:pStyle w:val="Compact"/>
+            </w:pPr>
+            <w:r>
+              <w:rPr>
+                <w:rFonts w:hint="eastAsia"/>
+              </w:rPr>
+              <w:t xml:space="preserve">身份</w:t>
+            </w:r>
+          </w:p>
+        </w:tc>
+        <w:tc>
+          <w:tcPr/>
+          <w:p>
+            <w:pPr>
+              <w:pStyle w:val="Compact"/>
+            </w:pPr>
+            <w:r>
+              <w:rPr>
+                <w:rFonts w:hint="eastAsia"/>
+              </w:rPr>
+              <w:t xml:space="preserve">来源细胞、培养条件、预处理、分离方法、阳性/阴性</w:t>
+            </w:r>
+            <w:r>
+              <w:t xml:space="preserve"> marker</w:t>
+            </w:r>
+          </w:p>
+        </w:tc>
+        <w:tc>
+          <w:tcPr/>
+          <w:p>
+            <w:pPr>
+              <w:pStyle w:val="Compact"/>
+            </w:pPr>
+            <w:r>
+              <w:rPr>
+                <w:rFonts w:hint="eastAsia"/>
+              </w:rPr>
+              <w:t xml:space="preserve">“MSC-EV”或“exosome”笼统命名</w:t>
+            </w:r>
+          </w:p>
+        </w:tc>
+        <w:tc>
+          <w:tcPr/>
+          <w:p>
+            <w:pPr>
+              <w:pStyle w:val="Compact"/>
+            </w:pPr>
+            <w:r>
+              <w:rPr>
+                <w:rFonts w:hint="eastAsia"/>
+              </w:rPr>
+              <w:t xml:space="preserve">决定免疫语义、批间差异和器官适应证</w:t>
+            </w:r>
+          </w:p>
+        </w:tc>
+      </w:tr>
+      <w:tr>
+        <w:tc>
+          <w:tcPr/>
+          <w:p>
+            <w:pPr>
+              <w:pStyle w:val="Compact"/>
+            </w:pPr>
+            <w:r>
+              <w:rPr>
+                <w:rFonts w:hint="eastAsia"/>
+              </w:rPr>
+              <w:t xml:space="preserve">纯度</w:t>
+            </w:r>
+          </w:p>
+        </w:tc>
+        <w:tc>
+          <w:tcPr/>
+          <w:p>
+            <w:pPr>
+              <w:pStyle w:val="Compact"/>
+            </w:pPr>
+            <w:r>
+              <w:rPr>
+                <w:rFonts w:hint="eastAsia"/>
+              </w:rPr>
+              <w:t xml:space="preserve">粒径分布、颗粒/蛋白比、脂蛋白/蛋白聚集体/血小板颗粒污染</w:t>
+            </w:r>
+          </w:p>
+        </w:tc>
+        <w:tc>
+          <w:tcPr/>
+          <w:p>
+            <w:pPr>
+              <w:pStyle w:val="Compact"/>
+            </w:pPr>
+            <w:r>
+              <w:rPr>
+                <w:rFonts w:hint="eastAsia"/>
+              </w:rPr>
+              <w:t xml:space="preserve">单一</w:t>
+            </w:r>
+            <w:r>
+              <w:t xml:space="preserve"> NTA </w:t>
+            </w:r>
+            <w:r>
+              <w:rPr>
+                <w:rFonts w:hint="eastAsia"/>
+              </w:rPr>
+              <w:t xml:space="preserve">粒子浓度</w:t>
+            </w:r>
+          </w:p>
+        </w:tc>
+        <w:tc>
+          <w:tcPr/>
+          <w:p>
+            <w:pPr>
+              <w:pStyle w:val="Compact"/>
+            </w:pPr>
+            <w:r>
+              <w:rPr>
+                <w:rFonts w:hint="eastAsia"/>
+              </w:rPr>
+              <w:t xml:space="preserve">避免把培养基残留或血液颗粒误认为</w:t>
+            </w:r>
+            <w:r>
+              <w:t xml:space="preserve"> EV </w:t>
+            </w:r>
+            <w:r>
+              <w:rPr>
+                <w:rFonts w:hint="eastAsia"/>
+              </w:rPr>
+              <w:t xml:space="preserve">药效</w:t>
+            </w:r>
+          </w:p>
+        </w:tc>
+      </w:tr>
+      <w:tr>
+        <w:tc>
+          <w:tcPr/>
+          <w:p>
+            <w:pPr>
+              <w:pStyle w:val="Compact"/>
+            </w:pPr>
+            <w:r>
+              <w:t xml:space="preserve">cargo</w:t>
+            </w:r>
+          </w:p>
+        </w:tc>
+        <w:tc>
+          <w:tcPr/>
+          <w:p>
+            <w:pPr>
+              <w:pStyle w:val="Compact"/>
+            </w:pPr>
+            <w:r>
+              <w:rPr>
+                <w:rFonts w:hint="eastAsia"/>
+              </w:rPr>
+              <w:t xml:space="preserve">关键</w:t>
+            </w:r>
+            <w:r>
+              <w:t xml:space="preserve"> </w:t>
+            </w:r>
+            <w:r>
+              <w:rPr>
+                <w:rFonts w:hint="eastAsia"/>
+              </w:rPr>
+              <w:t xml:space="preserve">miRNA、蛋白、脂质或线粒体相关</w:t>
+            </w:r>
+            <w:r>
+              <w:t xml:space="preserve"> cargo </w:t>
+            </w:r>
+            <w:r>
+              <w:rPr>
+                <w:rFonts w:hint="eastAsia"/>
+              </w:rPr>
+              <w:t xml:space="preserve">及其稳定性</w:t>
+            </w:r>
+          </w:p>
+        </w:tc>
+        <w:tc>
+          <w:tcPr/>
+          <w:p>
+            <w:pPr>
+              <w:pStyle w:val="Compact"/>
+            </w:pPr>
+            <w:r>
+              <w:rPr>
+                <w:rFonts w:hint="eastAsia"/>
+              </w:rPr>
+              <w:t xml:space="preserve">单个候选</w:t>
+            </w:r>
+            <w:r>
+              <w:t xml:space="preserve"> miRNA </w:t>
+            </w:r>
+            <w:r>
+              <w:rPr>
+                <w:rFonts w:hint="eastAsia"/>
+              </w:rPr>
+              <w:t xml:space="preserve">的表达变化</w:t>
+            </w:r>
+          </w:p>
+        </w:tc>
+        <w:tc>
+          <w:tcPr/>
+          <w:p>
+            <w:pPr>
+              <w:pStyle w:val="Compact"/>
+            </w:pPr>
+            <w:r>
+              <w:rPr>
+                <w:rFonts w:hint="eastAsia"/>
+              </w:rPr>
+              <w:t xml:space="preserve">解释为何能影响补体、铁死亡、焦亡或内皮屏障</w:t>
+            </w:r>
+          </w:p>
+        </w:tc>
+      </w:tr>
+      <w:tr>
+        <w:tc>
+          <w:tcPr/>
+          <w:p>
+            <w:pPr>
+              <w:pStyle w:val="Compact"/>
+            </w:pPr>
+            <w:r>
+              <w:rPr>
+                <w:rFonts w:hint="eastAsia"/>
+              </w:rPr>
+              <w:t xml:space="preserve">效价</w:t>
+            </w:r>
+          </w:p>
+        </w:tc>
+        <w:tc>
+          <w:tcPr/>
+          <w:p>
+            <w:pPr>
+              <w:pStyle w:val="Compact"/>
+            </w:pPr>
+            <w:r>
+              <w:rPr>
+                <w:rFonts w:hint="eastAsia"/>
+              </w:rPr>
+              <w:t xml:space="preserve">与器官和机制相连的功能试验，如糖萼保护、补体沉积下降、线粒体恢复或胆汁/尿液改善</w:t>
+            </w:r>
+          </w:p>
+        </w:tc>
+        <w:tc>
+          <w:tcPr/>
+          <w:p>
+            <w:pPr>
+              <w:pStyle w:val="Compact"/>
+            </w:pPr>
+            <w:r>
+              <w:rPr>
+                <w:rFonts w:hint="eastAsia"/>
+              </w:rPr>
+              <w:t xml:space="preserve">体外细胞活力升高</w:t>
+            </w:r>
+          </w:p>
+        </w:tc>
+        <w:tc>
+          <w:tcPr/>
+          <w:p>
+            <w:pPr>
+              <w:pStyle w:val="Compact"/>
+            </w:pPr>
+            <w:r>
+              <w:rPr>
+                <w:rFonts w:hint="eastAsia"/>
+              </w:rPr>
+              <w:t xml:space="preserve">把“抗炎叙事”转化为可放行、可比较的药效</w:t>
+            </w:r>
+          </w:p>
+        </w:tc>
+      </w:tr>
+      <w:tr>
+        <w:tc>
+          <w:tcPr/>
+          <w:p>
+            <w:pPr>
+              <w:pStyle w:val="Compact"/>
+            </w:pPr>
+            <w:r>
+              <w:rPr>
+                <w:rFonts w:hint="eastAsia"/>
+              </w:rPr>
+              <w:t xml:space="preserve">安全</w:t>
+            </w:r>
+          </w:p>
+        </w:tc>
+        <w:tc>
+          <w:tcPr/>
+          <w:p>
+            <w:pPr>
+              <w:pStyle w:val="Compact"/>
+            </w:pPr>
+            <w:r>
+              <w:rPr>
+                <w:rFonts w:hint="eastAsia"/>
+              </w:rPr>
+              <w:t xml:space="preserve">内毒素、无菌、支原体、残留</w:t>
+            </w:r>
+            <w:r>
+              <w:t xml:space="preserve"> </w:t>
+            </w:r>
+            <w:r>
+              <w:rPr>
+                <w:rFonts w:hint="eastAsia"/>
+              </w:rPr>
+              <w:t xml:space="preserve">DNA、促凝活性、洗脱残留</w:t>
+            </w:r>
+          </w:p>
+        </w:tc>
+        <w:tc>
+          <w:tcPr/>
+          <w:p>
+            <w:pPr>
+              <w:pStyle w:val="Compact"/>
+            </w:pPr>
+            <w:r>
+              <w:rPr>
+                <w:rFonts w:hint="eastAsia"/>
+              </w:rPr>
+              <w:t xml:space="preserve">急性毒性阴性</w:t>
+            </w:r>
+          </w:p>
+        </w:tc>
+        <w:tc>
+          <w:tcPr/>
+          <w:p>
+            <w:pPr>
+              <w:pStyle w:val="Compact"/>
+            </w:pPr>
+            <w:r>
+              <w:rPr>
+                <w:rFonts w:hint="eastAsia"/>
+              </w:rPr>
+              <w:t xml:space="preserve">对含血</w:t>
+            </w:r>
+            <w:r>
+              <w:t xml:space="preserve"> NMP、DCD </w:t>
+            </w:r>
+            <w:r>
+              <w:rPr>
+                <w:rFonts w:hint="eastAsia"/>
+              </w:rPr>
+              <w:t xml:space="preserve">器官和临床放行尤其关键</w:t>
+            </w:r>
+          </w:p>
+        </w:tc>
+      </w:tr>
+    </w:tbl>
     <w:bookmarkEnd w:id="12"/>
     <w:bookmarkStart w:id="13" w:name="递送时序hopenmp-与控制性复温的不同任务"/>
     <w:p>
@@ -3350,6 +4774,331 @@
         <w:t xml:space="preserve">。这三层不能互相替代：机制读数适合药效证明，临床决策读数适合器官取舍，而来源读数决定干预靶点。</w:t>
       </w:r>
     </w:p>
+    <w:p>
+      <w:pPr>
+        <w:pStyle w:val="BodyText"/>
+      </w:pPr>
+      <w:r>
+        <w:rPr>
+          <w:rFonts w:hint="eastAsia"/>
+          <w:b/>
+          <w:bCs/>
+        </w:rPr>
+        <w:t xml:space="preserve">表</w:t>
+      </w:r>
+      <w:r>
+        <w:rPr>
+          <w:b/>
+          <w:bCs/>
+        </w:rPr>
+        <w:t xml:space="preserve"> 4. </w:t>
+      </w:r>
+      <w:r>
+        <w:rPr>
+          <w:rFonts w:hint="eastAsia"/>
+          <w:b/>
+          <w:bCs/>
+        </w:rPr>
+        <w:t xml:space="preserve">灌注液</w:t>
+      </w:r>
+      <w:r>
+        <w:rPr>
+          <w:b/>
+          <w:bCs/>
+        </w:rPr>
+        <w:t xml:space="preserve"> EV </w:t>
+      </w:r>
+      <w:r>
+        <w:rPr>
+          <w:rFonts w:hint="eastAsia"/>
+          <w:b/>
+          <w:bCs/>
+        </w:rPr>
+        <w:t xml:space="preserve">标志物的三层决策框架。</w:t>
+      </w:r>
+    </w:p>
+    <w:tbl>
+      <w:tblPr>
+        <w:tblStyle w:val="Table"/>
+        <w:tblW w:type="pct" w:w="5000"/>
+        <w:tblLayout w:type="fixed"/>
+        <w:tblLook w:firstRow="1" w:lastRow="0" w:firstColumn="0" w:lastColumn="0" w:noHBand="0" w:noVBand="0" w:val="0020"/>
+      </w:tblPr>
+      <w:tblGrid>
+        <w:gridCol w:w="1980"/>
+        <w:gridCol w:w="1980"/>
+        <w:gridCol w:w="1980"/>
+        <w:gridCol w:w="1980"/>
+      </w:tblGrid>
+      <w:tr>
+        <w:trPr>
+          <w:tblHeader w:val="on"/>
+        </w:trPr>
+        <w:tc>
+          <w:tcPr/>
+          <w:p>
+            <w:pPr>
+              <w:pStyle w:val="Compact"/>
+            </w:pPr>
+            <w:r>
+              <w:rPr>
+                <w:rFonts w:hint="eastAsia"/>
+              </w:rPr>
+              <w:t xml:space="preserve">层级</w:t>
+            </w:r>
+          </w:p>
+        </w:tc>
+        <w:tc>
+          <w:tcPr/>
+          <w:p>
+            <w:pPr>
+              <w:pStyle w:val="Compact"/>
+            </w:pPr>
+            <w:r>
+              <w:rPr>
+                <w:rFonts w:hint="eastAsia"/>
+              </w:rPr>
+              <w:t xml:space="preserve">典型信号</w:t>
+            </w:r>
+          </w:p>
+        </w:tc>
+        <w:tc>
+          <w:tcPr/>
+          <w:p>
+            <w:pPr>
+              <w:pStyle w:val="Compact"/>
+            </w:pPr>
+            <w:r>
+              <w:rPr>
+                <w:rFonts w:hint="eastAsia"/>
+              </w:rPr>
+              <w:t xml:space="preserve">回答的问题</w:t>
+            </w:r>
+          </w:p>
+        </w:tc>
+        <w:tc>
+          <w:tcPr/>
+          <w:p>
+            <w:pPr>
+              <w:pStyle w:val="Compact"/>
+            </w:pPr>
+            <w:r>
+              <w:rPr>
+                <w:rFonts w:hint="eastAsia"/>
+              </w:rPr>
+              <w:t xml:space="preserve">对应行动</w:t>
+            </w:r>
+          </w:p>
+        </w:tc>
+      </w:tr>
+      <w:tr>
+        <w:tc>
+          <w:tcPr/>
+          <w:p>
+            <w:pPr>
+              <w:pStyle w:val="Compact"/>
+            </w:pPr>
+            <w:r>
+              <w:rPr>
+                <w:rFonts w:hint="eastAsia"/>
+              </w:rPr>
+              <w:t xml:space="preserve">来源定位</w:t>
+            </w:r>
+          </w:p>
+        </w:tc>
+        <w:tc>
+          <w:tcPr/>
+          <w:p>
+            <w:pPr>
+              <w:pStyle w:val="Compact"/>
+            </w:pPr>
+            <w:r>
+              <w:rPr>
+                <w:rFonts w:hint="eastAsia"/>
+              </w:rPr>
+              <w:t xml:space="preserve">肾小管、胆管、内皮、心肌、肺泡上皮或组织驻留免疫细胞相关</w:t>
+            </w:r>
+            <w:r>
+              <w:t xml:space="preserve"> EV/miRNA</w:t>
+            </w:r>
+          </w:p>
+        </w:tc>
+        <w:tc>
+          <w:tcPr/>
+          <w:p>
+            <w:pPr>
+              <w:pStyle w:val="Compact"/>
+            </w:pPr>
+            <w:r>
+              <w:rPr>
+                <w:rFonts w:hint="eastAsia"/>
+              </w:rPr>
+              <w:t xml:space="preserve">哪个解剖单元正在释放危险信号</w:t>
+            </w:r>
+          </w:p>
+        </w:tc>
+        <w:tc>
+          <w:tcPr/>
+          <w:p>
+            <w:pPr>
+              <w:pStyle w:val="Compact"/>
+            </w:pPr>
+            <w:r>
+              <w:rPr>
+                <w:rFonts w:hint="eastAsia"/>
+              </w:rPr>
+              <w:t xml:space="preserve">选择重点病理评估区域，决定是否需要器官特异性保护</w:t>
+            </w:r>
+          </w:p>
+        </w:tc>
+      </w:tr>
+      <w:tr>
+        <w:tc>
+          <w:tcPr/>
+          <w:p>
+            <w:pPr>
+              <w:pStyle w:val="Compact"/>
+            </w:pPr>
+            <w:r>
+              <w:rPr>
+                <w:rFonts w:hint="eastAsia"/>
+              </w:rPr>
+              <w:t xml:space="preserve">机制判读</w:t>
+            </w:r>
+          </w:p>
+        </w:tc>
+        <w:tc>
+          <w:tcPr/>
+          <w:p>
+            <w:pPr>
+              <w:pStyle w:val="Compact"/>
+            </w:pPr>
+            <w:r>
+              <w:rPr>
+                <w:rFonts w:hint="eastAsia"/>
+              </w:rPr>
+              <w:t xml:space="preserve">补体、凝血、炎症小体、线粒体应激、铁死亡、糖萼脱落相关</w:t>
+            </w:r>
+            <w:r>
+              <w:t xml:space="preserve"> cargo</w:t>
+            </w:r>
+          </w:p>
+        </w:tc>
+        <w:tc>
+          <w:tcPr/>
+          <w:p>
+            <w:pPr>
+              <w:pStyle w:val="Compact"/>
+            </w:pPr>
+            <w:r>
+              <w:rPr>
+                <w:rFonts w:hint="eastAsia"/>
+              </w:rPr>
+              <w:t xml:space="preserve">损伤网络正由哪条通路放大</w:t>
+            </w:r>
+          </w:p>
+        </w:tc>
+        <w:tc>
+          <w:tcPr/>
+          <w:p>
+            <w:pPr>
+              <w:pStyle w:val="Compact"/>
+            </w:pPr>
+            <w:r>
+              <w:rPr>
+                <w:rFonts w:hint="eastAsia"/>
+              </w:rPr>
+              <w:t xml:space="preserve">选择补体抑制、线粒体保护、抗铁死亡、内皮保护或</w:t>
+            </w:r>
+            <w:r>
+              <w:t xml:space="preserve"> EV </w:t>
+            </w:r>
+            <w:r>
+              <w:rPr>
+                <w:rFonts w:hint="eastAsia"/>
+              </w:rPr>
+              <w:t xml:space="preserve">递送策略</w:t>
+            </w:r>
+          </w:p>
+        </w:tc>
+      </w:tr>
+      <w:tr>
+        <w:tc>
+          <w:tcPr/>
+          <w:p>
+            <w:pPr>
+              <w:pStyle w:val="Compact"/>
+            </w:pPr>
+            <w:r>
+              <w:rPr>
+                <w:rFonts w:hint="eastAsia"/>
+              </w:rPr>
+              <w:t xml:space="preserve">临床决策</w:t>
+            </w:r>
+          </w:p>
+        </w:tc>
+        <w:tc>
+          <w:tcPr/>
+          <w:p>
+            <w:pPr>
+              <w:pStyle w:val="Compact"/>
+            </w:pPr>
+            <w:r>
+              <w:rPr>
+                <w:rFonts w:hint="eastAsia"/>
+              </w:rPr>
+              <w:t xml:space="preserve">与</w:t>
+            </w:r>
+            <w:r>
+              <w:t xml:space="preserve"> </w:t>
+            </w:r>
+            <w:r>
+              <w:rPr>
+                <w:rFonts w:hint="eastAsia"/>
+              </w:rPr>
+              <w:t xml:space="preserve">DGF、PGD、胆道并发症、急性排斥、dd-cfDNA</w:t>
+            </w:r>
+            <w:r>
+              <w:t xml:space="preserve"> </w:t>
+            </w:r>
+            <w:r>
+              <w:rPr>
+                <w:rFonts w:hint="eastAsia"/>
+              </w:rPr>
+              <w:t xml:space="preserve">或一年功能相关的组合模型</w:t>
+            </w:r>
+          </w:p>
+        </w:tc>
+        <w:tc>
+          <w:tcPr/>
+          <w:p>
+            <w:pPr>
+              <w:pStyle w:val="Compact"/>
+            </w:pPr>
+            <w:r>
+              <w:rPr>
+                <w:rFonts w:hint="eastAsia"/>
+              </w:rPr>
+              <w:t xml:space="preserve">这枚器官能否移植、是否需要强化监测</w:t>
+            </w:r>
+          </w:p>
+        </w:tc>
+        <w:tc>
+          <w:tcPr/>
+          <w:p>
+            <w:pPr>
+              <w:pStyle w:val="Compact"/>
+            </w:pPr>
+            <w:r>
+              <w:rPr>
+                <w:rFonts w:hint="eastAsia"/>
+              </w:rPr>
+              <w:t xml:space="preserve">器官取舍、灌注期追加干预、受体术后监测和免疫抑制调整</w:t>
+            </w:r>
+          </w:p>
+        </w:tc>
+      </w:tr>
+    </w:tbl>
     <w:p>
       <w:pPr>
         <w:pStyle w:val="BodyText"/>

</xml_diff>